<commit_message>
methods: reword to match the code (no interpolation)
</commit_message>
<xml_diff>
--- a/paper/paper.docx
+++ b/paper/paper.docx
@@ -692,13 +692,13 @@
         <w:t xml:space="preserve"> </w:t>
       </w:r>
       <w:r>
-        <w:t xml:space="preserve">from 30 minutes before to 240 minutes after and resample it onto a one-minute</w:t>
-      </w:r>
-      <w:r>
-        <w:t xml:space="preserve"> </w:t>
-      </w:r>
-      <w:r>
-        <w:t xml:space="preserve">grid relative to the meal, so every excursion is described on the same time axis.</w:t>
+        <w:t xml:space="preserve">from 30 minutes before to 240 minutes after and index it in minutes relative to</w:t>
+      </w:r>
+      <w:r>
+        <w:t xml:space="preserve"> </w:t>
+      </w:r>
+      <w:r>
+        <w:t xml:space="preserve">the meal, so every excursion is described on the same time axis.</w:t>
       </w:r>
       <w:r>
         <w:t xml:space="preserve"> </w:t>

</xml_diff>

<commit_message>
report re-id as the mean over splits, not a single draw
</commit_message>
<xml_diff>
--- a/paper/paper.docx
+++ b/paper/paper.docx
@@ -978,7 +978,13 @@
         <w:t xml:space="preserve"> </w:t>
       </w:r>
       <w:r>
-        <w:t xml:space="preserve">chance rates of 1/45 and 5/45.</w:t>
+        <w:t xml:space="preserve">chance rates of 1/45 and 5/45. We repeat this over 20 random gallery and probe</w:t>
+      </w:r>
+      <w:r>
+        <w:t xml:space="preserve"> </w:t>
+      </w:r>
+      <w:r>
+        <w:t xml:space="preserve">splits and report the mean.</w:t>
       </w:r>
     </w:p>
     <w:bookmarkEnd w:id="15"/>
@@ -1357,25 +1363,25 @@
         <w:t xml:space="preserve"> </w:t>
       </w:r>
       <w:r>
-        <w:t xml:space="preserve">held-out meal, the nearest-neighbour model names the correct person first 13</w:t>
-      </w:r>
-      <w:r>
-        <w:t xml:space="preserve"> </w:t>
-      </w:r>
-      <w:r>
-        <w:t xml:space="preserve">percent of the time, against a chance rate of about 2 percent, and it places the</w:t>
-      </w:r>
-      <w:r>
-        <w:t xml:space="preserve"> </w:t>
-      </w:r>
-      <w:r>
-        <w:t xml:space="preserve">correct person in its top five guesses 42 percent of the time, against a chance</w:t>
-      </w:r>
-      <w:r>
-        <w:t xml:space="preserve"> </w:t>
-      </w:r>
-      <w:r>
-        <w:t xml:space="preserve">rate of 11 percent. Both are several times chance. The accuracy is far from</w:t>
+        <w:t xml:space="preserve">held-out meal, the nearest-neighbour model names the correct person first about</w:t>
+      </w:r>
+      <w:r>
+        <w:t xml:space="preserve"> </w:t>
+      </w:r>
+      <w:r>
+        <w:t xml:space="preserve">15 percent of the time, against a chance rate of about 2 percent, and it places</w:t>
+      </w:r>
+      <w:r>
+        <w:t xml:space="preserve"> </w:t>
+      </w:r>
+      <w:r>
+        <w:t xml:space="preserve">the correct person in its top five guesses about 39 percent of the time, against</w:t>
+      </w:r>
+      <w:r>
+        <w:t xml:space="preserve"> </w:t>
+      </w:r>
+      <w:r>
+        <w:t xml:space="preserve">a chance rate of 11 percent (means over 20 random splits). Both are several times chance. The accuracy is far from</w:t>
       </w:r>
       <w:r>
         <w:t xml:space="preserve"> </w:t>

</xml_diff>

<commit_message>
mirror the ablation into the markdown and docx
</commit_message>
<xml_diff>
--- a/paper/paper.docx
+++ b/paper/paper.docx
@@ -1056,7 +1056,19 @@
         <w:t xml:space="preserve"> </w:t>
       </w:r>
       <w:r>
-        <w:t xml:space="preserve">logistic-regression coefficients.</w:t>
+        <w:t xml:space="preserve">logistic-regression coefficients. To test whether the excursion shape predicts</w:t>
+      </w:r>
+      <w:r>
+        <w:t xml:space="preserve"> </w:t>
+      </w:r>
+      <w:r>
+        <w:t xml:space="preserve">beyond glucose level, we also re-run this classifier on feature subsets that drop</w:t>
+      </w:r>
+      <w:r>
+        <w:t xml:space="preserve"> </w:t>
+      </w:r>
+      <w:r>
+        <w:t xml:space="preserve">the amplitude features.</w:t>
       </w:r>
     </w:p>
     <w:bookmarkEnd w:id="16"/>
@@ -1588,15 +1600,179 @@
         <w:t xml:space="preserve"> </w:t>
       </w:r>
       <w:r>
-        <w:t xml:space="preserve">open question is how much the shape of the excursion adds beyond height. We leave</w:t>
-      </w:r>
-      <w:r>
-        <w:t xml:space="preserve"> </w:t>
-      </w:r>
-      <w:r>
-        <w:t xml:space="preserve">a direct test of that, holding out the amplitude features, for future work.</w:t>
-      </w:r>
-    </w:p>
+        <w:t xml:space="preserve">open question is how much the shape of the excursion adds beyond height. To test</w:t>
+      </w:r>
+      <w:r>
+        <w:t xml:space="preserve"> </w:t>
+      </w:r>
+      <w:r>
+        <w:t xml:space="preserve">this directly, we re-ran the classifier on feature subsets. Removing peak and</w:t>
+      </w:r>
+      <w:r>
+        <w:t xml:space="preserve"> </w:t>
+      </w:r>
+      <w:r>
+        <w:t xml:space="preserve">baseline glucose lowers the AUC from 0.87 to 0.71, and dropping every amplitude</w:t>
+      </w:r>
+      <w:r>
+        <w:t xml:space="preserve"> </w:t>
+      </w:r>
+      <w:r>
+        <w:t xml:space="preserve">feature, leaving only timing, kinetic, and shape, still reaches 0.66, well above</w:t>
+      </w:r>
+      <w:r>
+        <w:t xml:space="preserve"> </w:t>
+      </w:r>
+      <w:r>
+        <w:t xml:space="preserve">the 0.5 chance level. Glucose level alone gives 0.85. Amplitude therefore carries</w:t>
+      </w:r>
+      <w:r>
+        <w:t xml:space="preserve"> </w:t>
+      </w:r>
+      <w:r>
+        <w:t xml:space="preserve">most of the signal, as the label makes inevitable, but the shape of the excursion</w:t>
+      </w:r>
+      <w:r>
+        <w:t xml:space="preserve"> </w:t>
+      </w:r>
+      <w:r>
+        <w:t xml:space="preserve">predicts diabetes on its own.</w:t>
+      </w:r>
+    </w:p>
+    <w:tbl>
+      <w:tblPr>
+        <w:tblStyle w:val="Table"/>
+        <w:tblW w:type="auto" w:w="0"/>
+        <w:tblLook w:firstRow="1" w:lastRow="0" w:firstColumn="0" w:lastColumn="0" w:noHBand="0" w:noVBand="0" w:val="0020"/>
+      </w:tblPr>
+      <w:tblGrid>
+        <w:gridCol w:w="3960"/>
+        <w:gridCol w:w="3960"/>
+      </w:tblGrid>
+      <w:tr>
+        <w:trPr>
+          <w:tblHeader w:val="on"/>
+        </w:trPr>
+        <w:tc>
+          <w:tcPr/>
+          <w:p>
+            <w:pPr>
+              <w:pStyle w:val="Compact"/>
+            </w:pPr>
+            <w:r>
+              <w:t xml:space="preserve">Feature set</w:t>
+            </w:r>
+          </w:p>
+        </w:tc>
+        <w:tc>
+          <w:tcPr/>
+          <w:p>
+            <w:pPr>
+              <w:pStyle w:val="Compact"/>
+            </w:pPr>
+            <w:r>
+              <w:t xml:space="preserve">AUC</w:t>
+            </w:r>
+          </w:p>
+        </w:tc>
+      </w:tr>
+      <w:tr>
+        <w:tc>
+          <w:tcPr/>
+          <w:p>
+            <w:pPr>
+              <w:pStyle w:val="Compact"/>
+            </w:pPr>
+            <w:r>
+              <w:t xml:space="preserve">All ten features</w:t>
+            </w:r>
+          </w:p>
+        </w:tc>
+        <w:tc>
+          <w:tcPr/>
+          <w:p>
+            <w:pPr>
+              <w:pStyle w:val="Compact"/>
+            </w:pPr>
+            <w:r>
+              <w:t xml:space="preserve">0.87</w:t>
+            </w:r>
+          </w:p>
+        </w:tc>
+      </w:tr>
+      <w:tr>
+        <w:tc>
+          <w:tcPr/>
+          <w:p>
+            <w:pPr>
+              <w:pStyle w:val="Compact"/>
+            </w:pPr>
+            <w:r>
+              <w:t xml:space="preserve">Without peak and baseline</w:t>
+            </w:r>
+          </w:p>
+        </w:tc>
+        <w:tc>
+          <w:tcPr/>
+          <w:p>
+            <w:pPr>
+              <w:pStyle w:val="Compact"/>
+            </w:pPr>
+            <w:r>
+              <w:t xml:space="preserve">0.71</w:t>
+            </w:r>
+          </w:p>
+        </w:tc>
+      </w:tr>
+      <w:tr>
+        <w:tc>
+          <w:tcPr/>
+          <w:p>
+            <w:pPr>
+              <w:pStyle w:val="Compact"/>
+            </w:pPr>
+            <w:r>
+              <w:t xml:space="preserve">Without any amplitude feature</w:t>
+            </w:r>
+          </w:p>
+        </w:tc>
+        <w:tc>
+          <w:tcPr/>
+          <w:p>
+            <w:pPr>
+              <w:pStyle w:val="Compact"/>
+            </w:pPr>
+            <w:r>
+              <w:t xml:space="preserve">0.66</w:t>
+            </w:r>
+          </w:p>
+        </w:tc>
+      </w:tr>
+      <w:tr>
+        <w:tc>
+          <w:tcPr/>
+          <w:p>
+            <w:pPr>
+              <w:pStyle w:val="Compact"/>
+            </w:pPr>
+            <w:r>
+              <w:t xml:space="preserve">Peak and baseline only</w:t>
+            </w:r>
+          </w:p>
+        </w:tc>
+        <w:tc>
+          <w:tcPr/>
+          <w:p>
+            <w:pPr>
+              <w:pStyle w:val="Compact"/>
+            </w:pPr>
+            <w:r>
+              <w:t xml:space="preserve">0.85</w:t>
+            </w:r>
+          </w:p>
+        </w:tc>
+      </w:tr>
+    </w:tbl>
     <w:bookmarkEnd w:id="30"/>
     <w:bookmarkEnd w:id="31"/>
     <w:bookmarkStart w:id="34" w:name="discussion"/>
@@ -1726,19 +1902,19 @@
         <w:t xml:space="preserve"> </w:t>
       </w:r>
       <w:r>
-        <w:t xml:space="preserve">result is expected almost by definition. We flag the shape and kinetic features as</w:t>
-      </w:r>
-      <w:r>
-        <w:t xml:space="preserve"> </w:t>
-      </w:r>
-      <w:r>
-        <w:t xml:space="preserve">the more interesting question and leave a clean test, holding out the amplitude</w:t>
-      </w:r>
-      <w:r>
-        <w:t xml:space="preserve"> </w:t>
-      </w:r>
-      <w:r>
-        <w:t xml:space="preserve">features, for later. The re-identification accuracy is well above chance but</w:t>
+        <w:t xml:space="preserve">result is expected almost by definition. The ablation above speaks to this: with the</w:t>
+      </w:r>
+      <w:r>
+        <w:t xml:space="preserve"> </w:t>
+      </w:r>
+      <w:r>
+        <w:t xml:space="preserve">amplitude features removed, the shape and kinetic features still predict above</w:t>
+      </w:r>
+      <w:r>
+        <w:t xml:space="preserve"> </w:t>
+      </w:r>
+      <w:r>
+        <w:t xml:space="preserve">chance, so the result is not only a restatement of glucose level. The re-identification accuracy is well above chance but</w:t>
       </w:r>
       <w:r>
         <w:t xml:space="preserve"> </w:t>

</xml_diff>

<commit_message>
report confidence intervals on the adjusted icc
</commit_message>
<xml_diff>
--- a/paper/paper.docx
+++ b/paper/paper.docx
@@ -852,7 +852,19 @@
         <w:t xml:space="preserve"> </w:t>
       </w:r>
       <w:r>
-        <w:t xml:space="preserve">explain.</w:t>
+        <w:t xml:space="preserve">explain. We attach a 95% confidence interval to each adjusted ICC with a cluster</w:t>
+      </w:r>
+      <w:r>
+        <w:t xml:space="preserve"> </w:t>
+      </w:r>
+      <w:r>
+        <w:t xml:space="preserve">bootstrap that resamples subjects with replacement 800 times, keeping each</w:t>
+      </w:r>
+      <w:r>
+        <w:t xml:space="preserve"> </w:t>
+      </w:r>
+      <w:r>
+        <w:t xml:space="preserve">person’s meals together.</w:t>
       </w:r>
     </w:p>
     <w:bookmarkEnd w:id="13"/>
@@ -1204,7 +1216,13 @@
         <w:t xml:space="preserve"> </w:t>
       </w:r>
       <w:r>
-        <w:t xml:space="preserve">the leaders: peak and baseline glucose keep adjusted ICCs of 0.24 and 0.20. In</w:t>
+        <w:t xml:space="preserve">the leaders: peak and baseline glucose keep adjusted ICCs of 0.24 (95% CI 0.15 to</w:t>
+      </w:r>
+      <w:r>
+        <w:t xml:space="preserve"> </w:t>
+      </w:r>
+      <w:r>
+        <w:t xml:space="preserve">0.33) and 0.20 (0.10 to 0.30). In</w:t>
       </w:r>
       <w:r>
         <w:t xml:space="preserve"> </w:t>

</xml_diff>